<commit_message>
Ephesians 7-gate 감사: KO 3건 수정(6:5-8 드리프트·3:14-19 EN primary·KO 타이틀 6장), 게이트 1-8 전부 통과
</commit_message>
<xml_diff>
--- a/gdocs_build/Ephesians.docx
+++ b/gdocs_build/Ephesians.docx
@@ -1819,7 +1819,7 @@
               <w:rPr>
                 <w:sz w:val="18"/>
               </w:rPr>
-              <w:t>나는 하늘과 땅의 모든 것에 이름을 주시는 위대하신 아버지 앞에 무릎 꿇고 응답해. 아버지께서 그분의 영으로 너희를 강하게 해주시길 기도해. 근육의 힘이 아니라 영광스러운 내면의 힘으로 말이야. 그래서 너희가 마음의 문을 열고 그분을 모셔 들여서 그리스도가 너희 안에 살게 해주시길. 또 너희가 사랑 위에 두 발로 굳게 서서, 예수를 따르는 모든 사람들과 함께 그리스도의 사랑이 얼마나 큰지 이해할 수 있게 해주시길 기도해. 팔 뻗어서 그 넓이를 경험해봐! 그 길이를 재봐! 그 깊이를 재봐! 그 높이까지 올라가봐! 하나님의 충만함 안에서 충만해져서, 꽉 찬 인생을 살아.</w:t>
+              <w:t>나는 하늘과 땅을 나누어 주시는 위대하신 아버지 앞에 무릎 꿇고 응답해. 아버지께서 그분의 영으로 너희를 강하게 해주시길 기도해. 근육의 힘이 아니라 영광스러운 내면의 힘으로 말이야. 그래서 너희가 마음의 문을 열고 그분을 모셔 들여서 그리스도가 너희 안에 살게 해주시길. 또 너희가 사랑 위에 두 발로 굳게 서서, 예수를 따르는 모든 사람들과 함께 그리스도의 사랑이 얼마나 큰지 이해할 수 있게 해주시길 기도해. 팔 뻗어서 그 넓이를 경험해봐! 그 길이를 재봐! 그 깊이를 재봐! 그 높이까지 올라가봐! 하나님의 충만함 안에서 충만해져서, 꽉 찬 인생을 살아.</w:t>
             </w:r>
           </w:p>
         </w:tc>
@@ -4300,7 +4300,7 @@
               <w:rPr>
                 <w:sz w:val="18"/>
               </w:rPr>
-              <w:t>일하는 사람들아, 이 땅의 상사를 존경하는 마음으로 복종하되, 진짜 주인이신 그리스도를 항상 의식하면서 일해. 시키는 일 대충 눈가림으로 하지 말고, 하나님의 뜻을 행하는 그리스도의 종으로서 진심으로 일해. 얼굴에는 미소를 띠고, 누가 시키든 사실은 하나님을 위해 일하는 거라는 걸 항상 기억해. 착한 일을 하면 일하는 사람이든 아니든 상관없이 주님께 제대로 상을 받을 거야.</w:t>
+              <w:t>일하는 사람들아, 이 땅의 상사를 존경하는 마음으로 복종하되, 진짜 주인이신 그리스도를 항상 의식하면서 일해. 시키는 일 대충 눈가림으로 하지 말고, 하나님의 뜻을 행하는 그리스도의 종으로서 진심으로 일해. 얼굴에는 미소를 띠고, 누가 시키든 사실은 하나님을 위해 일하는 거라는 걸 항상 기억해. 착한 일을 하면 종이든 자유인이든 상관없이 주님께 제대로 상을 받을 거야.</w:t>
             </w:r>
           </w:p>
         </w:tc>

</xml_diff>